<commit_message>
add contract signing flow and webhook integration scaffolding
</commit_message>
<xml_diff>
--- a/templates/client-care-letter-template.docx
+++ b/templates/client-care-letter-template.docx
@@ -1474,7 +1474,7 @@
           <w:sz w:val="24"/>
           <w:szCs w:val="24"/>
         </w:rPr>
-        <w:t xml:space="preserve"> outside </w:t>
+        <w:t xml:space="preserve"> {ApplicationLocation}</w:t>
       </w:r>
       <w:proofErr w:type="gramStart"/>
       <w:r>
@@ -1485,7 +1485,7 @@
           <w:sz w:val="24"/>
           <w:szCs w:val="24"/>
         </w:rPr>
-        <w:t>UK</w:t>
+        <w:t/>
       </w:r>
       <w:r>
         <w:rPr>

</xml_diff>